<commit_message>
Agregue variables 15 y 5 secs
</commit_message>
<xml_diff>
--- a/Datos.docx
+++ b/Datos.docx
@@ -557,6 +557,7 @@
       <w:r>
         <w:rPr>
           <w:rFonts w:ascii="Times New Roman" w:eastAsia="Times New Roman" w:hAnsi="Times New Roman" w:cs="Times New Roman"/>
+          <w:noProof/>
           <w:kern w:val="0"/>
           <w:lang w:eastAsia="es-AR"/>
           <w14:ligatures w14:val="none"/>
@@ -1120,71 +1121,16 @@
           <w:lang w:eastAsia="es-AR"/>
           <w14:ligatures w14:val="none"/>
         </w:rPr>
-        <w:t>Capacidad Térmica ($C_{</w:t>
-      </w:r>
-      <w:proofErr w:type="spellStart"/>
-      <w:r>
-        <w:rPr>
-          <w:rFonts w:ascii="Times New Roman" w:eastAsia="Times New Roman" w:hAnsi="Times New Roman" w:cs="Times New Roman"/>
-          <w:b/>
-          <w:bCs/>
-          <w:kern w:val="0"/>
-          <w:lang w:eastAsia="es-AR"/>
-          <w14:ligatures w14:val="none"/>
-        </w:rPr>
-        <w:t>termica</w:t>
-      </w:r>
-      <w:proofErr w:type="spellEnd"/>
-      <w:r>
-        <w:rPr>
-          <w:rFonts w:ascii="Times New Roman" w:eastAsia="Times New Roman" w:hAnsi="Times New Roman" w:cs="Times New Roman"/>
-          <w:b/>
-          <w:bCs/>
-          <w:kern w:val="0"/>
-          <w:lang w:eastAsia="es-AR"/>
-          <w14:ligatures w14:val="none"/>
-        </w:rPr>
-        <w:t>}$):</w:t>
-      </w:r>
-      <w:r>
-        <w:rPr>
-          <w:rFonts w:ascii="Times New Roman" w:eastAsia="Times New Roman" w:hAnsi="Times New Roman" w:cs="Times New Roman"/>
-          <w:kern w:val="0"/>
-          <w:lang w:eastAsia="es-AR"/>
-          <w14:ligatures w14:val="none"/>
-        </w:rPr>
-        <w:t xml:space="preserve"> Se estimó en $15.000 \</w:t>
-      </w:r>
-      <w:proofErr w:type="spellStart"/>
-      <w:proofErr w:type="gramStart"/>
-      <w:r>
-        <w:rPr>
-          <w:rFonts w:ascii="Times New Roman" w:eastAsia="Times New Roman" w:hAnsi="Times New Roman" w:cs="Times New Roman"/>
-          <w:kern w:val="0"/>
-          <w:lang w:eastAsia="es-AR"/>
-          <w14:ligatures w14:val="none"/>
-        </w:rPr>
-        <w:t>text</w:t>
-      </w:r>
-      <w:proofErr w:type="spellEnd"/>
-      <w:r>
-        <w:rPr>
-          <w:rFonts w:ascii="Times New Roman" w:eastAsia="Times New Roman" w:hAnsi="Times New Roman" w:cs="Times New Roman"/>
-          <w:kern w:val="0"/>
-          <w:lang w:eastAsia="es-AR"/>
-          <w14:ligatures w14:val="none"/>
-        </w:rPr>
-        <w:t>{ J</w:t>
-      </w:r>
-      <w:proofErr w:type="gramEnd"/>
-      <w:r>
-        <w:rPr>
-          <w:rFonts w:ascii="Times New Roman" w:eastAsia="Times New Roman" w:hAnsi="Times New Roman" w:cs="Times New Roman"/>
-          <w:kern w:val="0"/>
-          <w:lang w:eastAsia="es-AR"/>
-          <w14:ligatures w14:val="none"/>
-        </w:rPr>
-        <w:t>/K}$, considerando la masa de aire interna combinada con la inercia térmica de una carga estándar de líquidos (botellas).</w:t>
+        <w:t>Capacidad Térmica:</w:t>
+      </w:r>
+      <w:r>
+        <w:rPr>
+          <w:rFonts w:ascii="Times New Roman" w:eastAsia="Times New Roman" w:hAnsi="Times New Roman" w:cs="Times New Roman"/>
+          <w:kern w:val="0"/>
+          <w:lang w:eastAsia="es-AR"/>
+          <w14:ligatures w14:val="none"/>
+        </w:rPr>
+        <w:t xml:space="preserve"> Se estimó en $15.000$, considerando la masa de aire interna combinada con la inercia térmica de una carga estándar de líquidos (botellas).</w:t>
       </w:r>
     </w:p>
     <w:p>
@@ -1210,47 +1156,16 @@
           <w:lang w:eastAsia="es-AR"/>
           <w14:ligatures w14:val="none"/>
         </w:rPr>
-        <w:t>Resistencia Térmica ($R_{paredes}$):</w:t>
-      </w:r>
-      <w:r>
-        <w:rPr>
-          <w:rFonts w:ascii="Times New Roman" w:eastAsia="Times New Roman" w:hAnsi="Times New Roman" w:cs="Times New Roman"/>
-          <w:kern w:val="0"/>
-          <w:lang w:eastAsia="es-AR"/>
-          <w14:ligatures w14:val="none"/>
-        </w:rPr>
-        <w:t xml:space="preserve"> Se fijó en $0.2 \</w:t>
-      </w:r>
-      <w:proofErr w:type="spellStart"/>
-      <w:proofErr w:type="gramStart"/>
-      <w:r>
-        <w:rPr>
-          <w:rFonts w:ascii="Times New Roman" w:eastAsia="Times New Roman" w:hAnsi="Times New Roman" w:cs="Times New Roman"/>
-          <w:kern w:val="0"/>
-          <w:lang w:eastAsia="es-AR"/>
-          <w14:ligatures w14:val="none"/>
-        </w:rPr>
-        <w:t>text</w:t>
-      </w:r>
-      <w:proofErr w:type="spellEnd"/>
-      <w:r>
-        <w:rPr>
-          <w:rFonts w:ascii="Times New Roman" w:eastAsia="Times New Roman" w:hAnsi="Times New Roman" w:cs="Times New Roman"/>
-          <w:kern w:val="0"/>
-          <w:lang w:eastAsia="es-AR"/>
-          <w14:ligatures w14:val="none"/>
-        </w:rPr>
-        <w:t>{ K</w:t>
-      </w:r>
-      <w:proofErr w:type="gramEnd"/>
-      <w:r>
-        <w:rPr>
-          <w:rFonts w:ascii="Times New Roman" w:eastAsia="Times New Roman" w:hAnsi="Times New Roman" w:cs="Times New Roman"/>
-          <w:kern w:val="0"/>
-          <w:lang w:eastAsia="es-AR"/>
-          <w14:ligatures w14:val="none"/>
-        </w:rPr>
-        <w:t>/W}$, un valor representativo para poliuretano inyectado de espesor comercial estándar.</w:t>
+        <w:t>Resistencia Térmica:</w:t>
+      </w:r>
+      <w:r>
+        <w:rPr>
+          <w:rFonts w:ascii="Times New Roman" w:eastAsia="Times New Roman" w:hAnsi="Times New Roman" w:cs="Times New Roman"/>
+          <w:kern w:val="0"/>
+          <w:lang w:eastAsia="es-AR"/>
+          <w14:ligatures w14:val="none"/>
+        </w:rPr>
+        <w:t xml:space="preserve"> Se fijó en $0.2$, un valor representativo para poliuretano inyectado de espesor comercial estándar.</w:t>
       </w:r>
     </w:p>
     <w:p>
@@ -3503,6 +3418,7 @@
   <w:style w:type="character" w:default="1" w:styleId="Fuentedeprrafopredeter">
     <w:name w:val="Default Paragraph Font"/>
     <w:uiPriority w:val="1"/>
+    <w:semiHidden/>
     <w:unhideWhenUsed/>
   </w:style>
   <w:style w:type="table" w:default="1" w:styleId="Tablanormal">

</xml_diff>